<commit_message>
Ve lai hinh anh 3 co le bu long mo men luc cho Cau 11 va cap nhat file Word
</commit_message>
<xml_diff>
--- a/San_Pham/De_Cuong_KHTN_8_Giua_HK1_Minh_Khai.docx
+++ b/San_Pham/De_Cuong_KHTN_8_Giua_HK1_Minh_Khai.docx
@@ -13921,9 +13921,7 @@
           <w:i w:val="0"/>
           <w:sz w:val="21"/>
         </w:rPr>
-        <w:t xml:space="preserve"> sinh ra làm bóng bay phồng lên.</w:t>
-        <w:br/>
-        <w:t>[HÌNH ẢNH: Bình tam giác nối bóng bay phồng to]</w:t>
+        <w:t xml:space="preserve"> sinh ra làm bóng bay phồng lên như hình vẽ dưới đây.</w:t>
         <w:br/>
         <w:t>Chọn đáp án đúng và ghép a–b–c–d ở cột (I) với các số tương ứng ở cột (II):</w:t>
       </w:r>
@@ -13936,7 +13934,7 @@
       <w:r>
         <w:drawing>
           <wp:inline xmlns:a="http://schemas.openxmlformats.org/drawingml/2006/main" xmlns:pic="http://schemas.openxmlformats.org/drawingml/2006/picture">
-            <wp:extent cx="2340000" cy="1683290"/>
+            <wp:extent cx="4500000" cy="2622069"/>
             <wp:docPr id="1" name="Picture 1"/>
             <wp:cNvGraphicFramePr>
               <a:graphicFrameLocks noChangeAspect="1"/>
@@ -13957,7 +13955,7 @@
                   <pic:spPr>
                     <a:xfrm>
                       <a:off x="0" y="0"/>
-                      <a:ext cx="2340000" cy="1683290"/>
+                      <a:ext cx="4500000" cy="2622069"/>
                     </a:xfrm>
                     <a:prstGeom prst="rect"/>
                   </pic:spPr>
@@ -16740,8 +16738,6 @@
           <w:sz w:val="21"/>
         </w:rPr>
         <w:t>Đặt lực F có độ lớn bằng nhau tại các vị trí khác nhau trên cờ lê như hình dưới đây để lắp bu lông. Hình nào bu lông sẽ không quay, hình nào bu lông quay dễ dàng nhất? Vì sao?</w:t>
-        <w:br/>
-        <w:t>[HÌNH ẢNH: 3 cờ lê a), b), c)]</w:t>
       </w:r>
     </w:p>
     <w:p>
@@ -16752,7 +16748,7 @@
       <w:r>
         <w:drawing>
           <wp:inline xmlns:a="http://schemas.openxmlformats.org/drawingml/2006/main" xmlns:pic="http://schemas.openxmlformats.org/drawingml/2006/picture">
-            <wp:extent cx="5040000" cy="904615"/>
+            <wp:extent cx="5040000" cy="1401145"/>
             <wp:docPr id="2" name="Picture 2"/>
             <wp:cNvGraphicFramePr>
               <a:graphicFrameLocks noChangeAspect="1"/>
@@ -16773,7 +16769,7 @@
                   <pic:spPr>
                     <a:xfrm>
                       <a:off x="0" y="0"/>
-                      <a:ext cx="5040000" cy="904615"/>
+                      <a:ext cx="5040000" cy="1401145"/>
                     </a:xfrm>
                     <a:prstGeom prst="rect"/>
                   </pic:spPr>

</xml_diff>